<commit_message>
Update the report for the Vercel deployment and the two new incidents
Section 7 now describes the Vercel import, the serverless entry point and the
real live URL instead of the Render blueprint. Section 8 adds the hosting
change and the React Native FormData upload failure. PDF regenerated.

Co-Authored-By: Claude Opus 5 <noreply@anthropic.com>
</commit_message>
<xml_diff>
--- a/docs/QuickBite_Report.docx
+++ b/docs/QuickBite_Report.docx
@@ -345,10 +345,7 @@
         <w:spacing w:after="40"/>
       </w:pPr>
       <w:r>
-        <w:rPr>
-          <w:b w:val="0"/>
-        </w:rPr>
-        <w:t>Backend deployed on Render and connected to MongoDB Atlas.</w:t>
+        <w:t xml:space="preserve">Backend deployed on Vercel and connected to MongoDB Atlas.</w:t>
       </w:r>
     </w:p>
     <w:p>
@@ -999,12 +996,8 @@
             <w:pPr>
               <w:spacing w:after="0" w:line="240" w:lineRule="auto"/>
             </w:pPr>
-            <w:r/>
             <w:r>
-              <w:rPr>
-                <w:sz w:val="19"/>
-              </w:rPr>
-              <w:t>Render (web service), GitHub</w:t>
+              <w:t xml:space="preserve">Vercel (serverless functions), GitHub</w:t>
             </w:r>
           </w:p>
         </w:tc>
@@ -1488,21 +1481,7 @@
         <w:spacing w:after="40"/>
       </w:pPr>
       <w:r>
-        <w:rPr>
-          <w:b w:val="0"/>
-        </w:rPr>
-      </w:r>
-      <w:r>
-        <w:rPr>
-          <w:b/>
-        </w:rPr>
-        <w:t>Images stored in MongoDB.</w:t>
-      </w:r>
-      <w:r>
-        <w:rPr>
-          <w:b w:val="0"/>
-        </w:rPr>
-        <w:t xml:space="preserve"> Render's file system is ephemeral (wiped on every deploy/restart), so uploaded files cannot be kept on disk. The image bytes are stored in the MenuItem document (limited to 2 MB) and served by GET /api/menu/:id/image; the list endpoints never return the bytes.</w:t>
+        <w:t xml:space="preserve">Images are stored in MongoDB. The hosting platform runs the API as a serverless function with an ephemeral file system, so uploaded files cannot be kept on disk. The image bytes are stored in the MenuItem document and served back by GET /api/menu/:id/image.</w:t>
       </w:r>
     </w:p>
     <w:p>
@@ -2279,12 +2258,8 @@
             <w:pPr>
               <w:spacing w:after="0" w:line="240" w:lineRule="auto"/>
             </w:pPr>
-            <w:r/>
             <w:r>
-              <w:rPr>
-                <w:sz w:val="17"/>
-              </w:rPr>
-              <w:t>Health check used by Render</w:t>
+              <w:t xml:space="preserve">Health check used to confirm the deployment is live</w:t>
             </w:r>
           </w:p>
         </w:tc>
@@ -5313,21 +5288,7 @@
         <w:spacing w:after="40"/>
       </w:pPr>
       <w:r>
-        <w:rPr>
-          <w:b w:val="0"/>
-        </w:rPr>
-      </w:r>
-      <w:r>
-        <w:rPr>
-          <w:b/>
-        </w:rPr>
-        <w:t>MongoDB Atlas:</w:t>
-      </w:r>
-      <w:r>
-        <w:rPr>
-          <w:b w:val="0"/>
-        </w:rPr>
-        <w:t xml:space="preserve"> created a free M0 cluster, a database user with read/write access, and allowed network access from 0.0.0.0/0 because Render does not have a fixed outbound IP. Copied the connection string and added the database name quickbite.</w:t>
+        <w:t xml:space="preserve">MongoDB Atlas: created a free M0 cluster (AWS Mumbai), a database user with read/write access, and allowed network access from 0.0.0.0/0 because the hosting platform has no fixed outbound IP address. The connection string was copied and the database name quickbite added before the query string.</w:t>
       </w:r>
     </w:p>
     <w:p>
@@ -5359,21 +5320,7 @@
         <w:spacing w:after="40"/>
       </w:pPr>
       <w:r>
-        <w:rPr>
-          <w:b w:val="0"/>
-        </w:rPr>
-      </w:r>
-      <w:r>
-        <w:rPr>
-          <w:b/>
-        </w:rPr>
-        <w:t>Render:</w:t>
-      </w:r>
-      <w:r>
-        <w:rPr>
-          <w:b w:val="0"/>
-        </w:rPr>
-        <w:t xml:space="preserve"> New → Blueprint → selected the repository. render.yaml creates the web service quickbite-api with root directory backend, build command npm install, start command npm start and health check /api/health.</w:t>
+        <w:t xml:space="preserve">Vercel: Add New → Project → imported the GitHub repository. Vercel detected the Express preset and the backend root directory. backend/api/index.js exports the Express app as a serverless function and backend/vercel.json rewrites every path to it, so src/server.js (app.listen) is used only for local development.</w:t>
       </w:r>
     </w:p>
     <w:p>
@@ -5382,21 +5329,7 @@
         <w:spacing w:after="40"/>
       </w:pPr>
       <w:r>
-        <w:rPr>
-          <w:b w:val="0"/>
-        </w:rPr>
-      </w:r>
-      <w:r>
-        <w:rPr>
-          <w:b/>
-        </w:rPr>
-        <w:t>Environment variables on Render:</w:t>
-      </w:r>
-      <w:r>
-        <w:rPr>
-          <w:b w:val="0"/>
-        </w:rPr>
-        <w:t xml:space="preserve"> MONGO_URI, JWT_SECRET (generated), JWT_EXPIRES_IN=7d, NODE_ENV=production. PORT is provided by Render.</w:t>
+        <w:t xml:space="preserve">Environment variables on Vercel: MONGO_URI, JWT_SECRET and JWT_EXPIRES_IN=7d.</w:t>
       </w:r>
     </w:p>
     <w:p>
@@ -5405,21 +5338,7 @@
         <w:spacing w:after="40"/>
       </w:pPr>
       <w:r>
-        <w:rPr>
-          <w:b w:val="0"/>
-        </w:rPr>
-      </w:r>
-      <w:r>
-        <w:rPr>
-          <w:b/>
-        </w:rPr>
-        <w:t>Verification:</w:t>
-      </w:r>
-      <w:r>
-        <w:rPr>
-          <w:b w:val="0"/>
-        </w:rPr>
-        <w:t xml:space="preserve"> opened https://&lt;service&gt;.onrender.com/api/health and received {"status":"ok"}; the Render log showed “MongoDB connected”.</w:t>
+        <w:t xml:space="preserve">Verification: opened https://quickbite-api-three.vercel.app/api/health and received {"status":"ok"}, then ran a scripted check of the business rules against the hosted API (15/15 passed, including image upload, stock reservation and the status workflow).</w:t>
       </w:r>
     </w:p>
     <w:p>
@@ -5451,21 +5370,7 @@
         <w:spacing w:after="40"/>
       </w:pPr>
       <w:r>
-        <w:rPr>
-          <w:b w:val="0"/>
-        </w:rPr>
-      </w:r>
-      <w:r>
-        <w:rPr>
-          <w:b/>
-        </w:rPr>
-        <w:t>Mobile:</w:t>
-      </w:r>
-      <w:r>
-        <w:rPr>
-          <w:b w:val="0"/>
-        </w:rPr>
-        <w:t xml:space="preserve"> set EXPO_PUBLIC_API_URL in mobile/.env to the Render URL, restarted Expo with npx expo start -c and tested on a phone using Expo Go.</w:t>
+        <w:t xml:space="preserve">Mobile: set EXPO_PUBLIC_API_URL in mobile/.env to the hosted base URL (without a trailing /api, because every request path already begins with /api) and restarted Expo with npx expo start -c, then tested on a physical Android phone through Expo Go.</w:t>
       </w:r>
     </w:p>
     <w:tbl>
@@ -5565,12 +5470,8 @@
             <w:pPr>
               <w:spacing w:after="0" w:line="240" w:lineRule="auto"/>
             </w:pPr>
-            <w:r/>
             <w:r>
-              <w:rPr>
-                <w:sz w:val="19"/>
-              </w:rPr>
-              <w:t>Render / backend .env</w:t>
+              <w:t xml:space="preserve">Vercel / backend .env</w:t>
             </w:r>
           </w:p>
         </w:tc>
@@ -5618,12 +5519,8 @@
             <w:pPr>
               <w:spacing w:after="0" w:line="240" w:lineRule="auto"/>
             </w:pPr>
-            <w:r/>
             <w:r>
-              <w:rPr>
-                <w:sz w:val="19"/>
-              </w:rPr>
-              <w:t>Render / backend .env</w:t>
+              <w:t xml:space="preserve">Vercel / backend .env</w:t>
             </w:r>
           </w:p>
         </w:tc>
@@ -5671,12 +5568,8 @@
             <w:pPr>
               <w:spacing w:after="0" w:line="240" w:lineRule="auto"/>
             </w:pPr>
-            <w:r/>
             <w:r>
-              <w:rPr>
-                <w:sz w:val="19"/>
-              </w:rPr>
-              <w:t>Render / backend .env</w:t>
+              <w:t xml:space="preserve">Vercel / backend .env</w:t>
             </w:r>
           </w:p>
         </w:tc>
@@ -5724,12 +5617,8 @@
             <w:pPr>
               <w:spacing w:after="0" w:line="240" w:lineRule="auto"/>
             </w:pPr>
-            <w:r/>
             <w:r>
-              <w:rPr>
-                <w:sz w:val="19"/>
-              </w:rPr>
-              <w:t>Render (automatic)</w:t>
+              <w:t xml:space="preserve">local backend .env only (Vercel does not use it)</w:t>
             </w:r>
           </w:p>
         </w:tc>
@@ -5847,12 +5736,8 @@
             <w:pPr>
               <w:spacing w:after="0" w:line="240" w:lineRule="auto"/>
             </w:pPr>
-            <w:r/>
             <w:r>
-              <w:rPr>
-                <w:sz w:val="19"/>
-              </w:rPr>
-              <w:t>https://&lt;service&gt;.onrender.com</w:t>
+              <w:t xml:space="preserve">https://quickbite-api-three.vercel.app</w:t>
             </w:r>
           </w:p>
         </w:tc>
@@ -5864,11 +5749,7 @@
         <w:jc w:val="both"/>
       </w:pPr>
       <w:r>
-        <w:rPr>
-          <w:b/>
-          <w:i w:val="0"/>
-        </w:rPr>
-        <w:t>Live backend URL: https://&lt;service&gt;.onrender.com   ·   Repository: https://github.com/&lt;user&gt;/quickbite-mobile</w:t>
+        <w:t xml:space="preserve">Live backend URL: https://quickbite-api-three.vercel.app   ·   Repository: https://github.com/IT21244384/quickbite-mobile</w:t>
       </w:r>
     </w:p>
     <w:p>
@@ -6017,11 +5898,7 @@
         <w:jc w:val="both"/>
       </w:pPr>
       <w:r>
-        <w:rPr>
-          <w:b/>
-          <w:i w:val="0"/>
-        </w:rPr>
-        <w:t>Cold start on Render's free plan</w:t>
+        <w:t xml:space="preserve">Hosting had to be changed from Render to Vercel</w:t>
       </w:r>
     </w:p>
     <w:p>
@@ -6029,11 +5906,23 @@
         <w:jc w:val="both"/>
       </w:pPr>
       <w:r>
-        <w:rPr>
-          <w:b w:val="0"/>
-          <w:i w:val="0"/>
-        </w:rPr>
-        <w:t>The free service sleeps after 15 minutes and the first request takes about 50 seconds. The app shows loading states, and /api/health should be opened before a demo to wake the service.</w:t>
+        <w:t xml:space="preserve">The backend was first prepared for Render, and render.yaml is still in the repository. Render now requires a payment card before a Blueprint can be created, so the API was moved to Vercel’s free tier instead. That meant adding backend/api/index.js, which exports the same Express app as a serverless function, and backend/vercel.json to route every path to it. Because a warm function is reused between requests, the Mongoose connection promise is cached in module scope rather than reconnecting on every call.</w:t>
+      </w:r>
+    </w:p>
+    <w:p>
+      <w:pPr>
+        <w:jc w:val="both"/>
+      </w:pPr>
+      <w:r>
+        <w:t xml:space="preserve">Uploading a photo failed with a misleading error</w:t>
+      </w:r>
+    </w:p>
+    <w:p>
+      <w:pPr>
+        <w:jc w:val="both"/>
+      </w:pPr>
+      <w:r>
+        <w:t xml:space="preserve">Creating a menu item from the phone always showed “Cannot reach the server”, although the hosted API answered normally and uploads of 50 KB to 1.9 MB succeeded when sent from a computer. Printing the underlying error on the device showed the real cause: “Unsupported FormDataPart implementation”. React Native 0.80 replaced its networking layer, and the old { uri, name, type } file object is no longer accepted by FormData. The picked image is now read into a Blob before it is appended, with its MIME type re-applied when the blob comes back without one. Lesson: a friendly catch-all error message can hide the fault, so the development build now shows the underlying reason as well.</w:t>
       </w:r>
     </w:p>
     <w:p>

</xml_diff>